<commit_message>
TAE document: portrait page 2 with the graph sheet rotated 90 degrees
Co-Authored-By: Claude Sonnet 5.5 <noreply@anthropic.com>
Claude-Session: https://claude.ai/code/session_016jKrcCZngfwqnGnaezhMcB
</commit_message>
<xml_diff>
--- a/maths_TAE_1st_page.docx
+++ b/maths_TAE_1st_page.docx
@@ -546,7 +546,7 @@
       <w:r>
         <w:drawing>
           <wp:inline distT="0" distB="0" distL="0" distR="0">
-            <wp:extent cx="8595360" cy="6080421"/>
+            <wp:extent cx="6145106" cy="8686800"/>
             <wp:effectExtent l="0" t="0" r="0" b="0"/>
             <wp:docPr id="2" name="Family Tree as a Graph" descr="Family Tree as a Graph - Bhadke family"/>
             <wp:cNvGraphicFramePr>
@@ -570,7 +570,7 @@
                   <pic:spPr>
                     <a:xfrm>
                       <a:off x="0" y="0"/>
-                      <a:ext cx="8595360" cy="6080421"/>
+                      <a:ext cx="6145106" cy="8686800"/>
                     </a:xfrm>
                     <a:prstGeom prst="rect">
                       <a:avLst/>
@@ -584,7 +584,7 @@
       </w:r>
     </w:p>
     <w:sectPr>
-      <w:pgSz w:w="15840" w:h="12240" w:orient="landscape"/>
+      <w:pgSz w:w="12240" w:h="15840"/>
       <w:pgMar w:top="720" w:right="720" w:bottom="720" w:left="720" w:header="720" w:footer="720" w:gutter="0"/>
       <w:pgBorders w:offsetFrom="page">
         <w:top w:val="thinThickSmallGap" w:color="auto" w:sz="24" w:space="24"/>

</xml_diff>